<commit_message>
Updated technical support document
</commit_message>
<xml_diff>
--- a/Insomniac_Technical_Support_Document.docx
+++ b/Insomniac_Technical_Support_Document.docx
@@ -68,6 +68,25 @@
         <w:t>Insomnia</w:t>
       </w:r>
     </w:p>
+    <w:p>
+      <w:pPr>
+        <w:pStyle w:val="Subtitle"/>
+        <w:jc w:val="center"/>
+        <w:rPr>
+          <w:rFonts w:ascii="Times New Roman" w:hAnsi="Times New Roman" w:cs="Times New Roman"/>
+          <w:sz w:val="32"/>
+          <w:szCs w:val="32"/>
+        </w:rPr>
+      </w:pPr>
+      <w:r>
+        <w:rPr>
+          <w:rFonts w:ascii="Times New Roman" w:hAnsi="Times New Roman" w:cs="Times New Roman"/>
+          <w:sz w:val="32"/>
+          <w:szCs w:val="32"/>
+        </w:rPr>
+        <w:t>2-D Interactive Game</w:t>
+      </w:r>
+    </w:p>
     <w:p/>
     <w:p/>
     <w:p>
@@ -89,7 +108,7 @@
           <w:sz w:val="28"/>
           <w:szCs w:val="28"/>
         </w:rPr>
-        <w:t>Prepared by:</w:t>
+        <w:t>Prepared by</w:t>
       </w:r>
       <w:r>
         <w:rPr>
@@ -100,7 +119,38 @@
           <w:szCs w:val="28"/>
         </w:rPr>
         <w:br/>
-        <w:t>Jessica Coffel, Thomas DiGuido, and Nick Pokusa</w:t>
+        <w:t>Lopsided Productions:</w:t>
+      </w:r>
+      <w:r>
+        <w:rPr>
+          <w:i w:val="0"/>
+          <w:iCs w:val="0"/>
+          <w:color w:val="000000" w:themeColor="text1"/>
+          <w:sz w:val="28"/>
+          <w:szCs w:val="28"/>
+        </w:rPr>
+        <w:br/>
+        <w:t>Jessica Coffel, T</w:t>
+      </w:r>
+      <w:r>
+        <w:rPr>
+          <w:i w:val="0"/>
+          <w:iCs w:val="0"/>
+          <w:color w:val="000000" w:themeColor="text1"/>
+          <w:sz w:val="28"/>
+          <w:szCs w:val="28"/>
+        </w:rPr>
+        <w:t>om</w:t>
+      </w:r>
+      <w:r>
+        <w:rPr>
+          <w:i w:val="0"/>
+          <w:iCs w:val="0"/>
+          <w:color w:val="000000" w:themeColor="text1"/>
+          <w:sz w:val="28"/>
+          <w:szCs w:val="28"/>
+        </w:rPr>
+        <w:t xml:space="preserve"> DiGuido, and Nick Pokusa</w:t>
       </w:r>
     </w:p>
     <w:p/>
@@ -136,7 +186,7 @@
         <w:rPr>
           <w:rFonts w:ascii="Times New Roman" w:hAnsi="Times New Roman" w:cs="Times New Roman"/>
         </w:rPr>
-        <w:t>0</w:t>
+        <w:t>1</w:t>
       </w:r>
     </w:p>
     <w:p>
@@ -157,10 +207,21 @@
         <w:rPr>
           <w:rFonts w:ascii="Times New Roman" w:hAnsi="Times New Roman" w:cs="Times New Roman"/>
         </w:rPr>
-        <w:t>04/29/26</w:t>
+        <w:t>0</w:t>
+      </w:r>
+      <w:r>
+        <w:rPr>
+          <w:rFonts w:ascii="Times New Roman" w:hAnsi="Times New Roman" w:cs="Times New Roman"/>
+        </w:rPr>
+        <w:t>5/05</w:t>
+      </w:r>
+      <w:r>
+        <w:rPr>
+          <w:rFonts w:ascii="Times New Roman" w:hAnsi="Times New Roman" w:cs="Times New Roman"/>
+        </w:rPr>
+        <w:t>/26</w:t>
       </w:r>
     </w:p>
-    <w:p/>
     <w:p>
       <w:pPr>
         <w:sectPr>
@@ -171,7 +232,6 @@
         </w:sectPr>
       </w:pPr>
     </w:p>
-    <w:p/>
     <w:p>
       <w:pPr>
         <w:pStyle w:val="Subtitle"/>
@@ -189,6 +249,7 @@
           <w:sz w:val="32"/>
           <w:szCs w:val="32"/>
         </w:rPr>
+        <w:lastRenderedPageBreak/>
         <w:t xml:space="preserve">Table of </w:t>
       </w:r>
       <w:r>
@@ -220,9 +281,6 @@
       <w:r>
         <w:rPr>
           <w:rFonts w:ascii="Times New Roman" w:hAnsi="Times New Roman"/>
-          <w:b w:val="0"/>
-          <w:bCs w:val="0"/>
-          <w:caps w:val="0"/>
           <w:sz w:val="24"/>
           <w:szCs w:val="24"/>
         </w:rPr>
@@ -231,9 +289,6 @@
       <w:r>
         <w:rPr>
           <w:rFonts w:ascii="Times New Roman" w:hAnsi="Times New Roman"/>
-          <w:b w:val="0"/>
-          <w:bCs w:val="0"/>
-          <w:caps w:val="0"/>
           <w:sz w:val="24"/>
           <w:szCs w:val="24"/>
         </w:rPr>
@@ -242,15 +297,12 @@
       <w:r>
         <w:rPr>
           <w:rFonts w:ascii="Times New Roman" w:hAnsi="Times New Roman"/>
-          <w:b w:val="0"/>
-          <w:bCs w:val="0"/>
-          <w:caps w:val="0"/>
           <w:sz w:val="24"/>
           <w:szCs w:val="24"/>
         </w:rPr>
         <w:fldChar w:fldCharType="separate"/>
       </w:r>
-      <w:hyperlink w:anchor="_Toc228386250" w:history="1">
+      <w:hyperlink w:anchor="_Toc228890753" w:history="1">
         <w:r>
           <w:rPr>
             <w:rStyle w:val="Hyperlink"/>
@@ -301,7 +353,7 @@
             <w:noProof/>
             <w:webHidden/>
           </w:rPr>
-          <w:instrText xml:space="preserve"> PAGEREF _Toc228386250 \h </w:instrText>
+          <w:instrText xml:space="preserve"> PAGEREF _Toc228890753 \h </w:instrText>
         </w:r>
         <w:r>
           <w:rPr>
@@ -345,7 +397,7 @@
           <w14:ligatures w14:val="standardContextual"/>
         </w:rPr>
       </w:pPr>
-      <w:hyperlink w:anchor="_Toc228386251" w:history="1">
+      <w:hyperlink w:anchor="_Toc228890754" w:history="1">
         <w:r>
           <w:rPr>
             <w:rStyle w:val="Hyperlink"/>
@@ -388,7 +440,7 @@
           <w:rPr>
             <w:webHidden/>
           </w:rPr>
-          <w:instrText xml:space="preserve"> PAGEREF _Toc228386251 \h </w:instrText>
+          <w:instrText xml:space="preserve"> PAGEREF _Toc228890754 \h </w:instrText>
         </w:r>
         <w:r>
           <w:rPr>
@@ -428,7 +480,7 @@
           <w14:ligatures w14:val="standardContextual"/>
         </w:rPr>
       </w:pPr>
-      <w:hyperlink w:anchor="_Toc228386252" w:history="1">
+      <w:hyperlink w:anchor="_Toc228890755" w:history="1">
         <w:r>
           <w:rPr>
             <w:rStyle w:val="Hyperlink"/>
@@ -471,7 +523,7 @@
           <w:rPr>
             <w:webHidden/>
           </w:rPr>
-          <w:instrText xml:space="preserve"> PAGEREF _Toc228386252 \h </w:instrText>
+          <w:instrText xml:space="preserve"> PAGEREF _Toc228890755 \h </w:instrText>
         </w:r>
         <w:r>
           <w:rPr>
@@ -511,7 +563,7 @@
           <w14:ligatures w14:val="standardContextual"/>
         </w:rPr>
       </w:pPr>
-      <w:hyperlink w:anchor="_Toc228386253" w:history="1">
+      <w:hyperlink w:anchor="_Toc228890756" w:history="1">
         <w:r>
           <w:rPr>
             <w:rStyle w:val="Hyperlink"/>
@@ -554,7 +606,7 @@
           <w:rPr>
             <w:webHidden/>
           </w:rPr>
-          <w:instrText xml:space="preserve"> PAGEREF _Toc228386253 \h </w:instrText>
+          <w:instrText xml:space="preserve"> PAGEREF _Toc228890756 \h </w:instrText>
         </w:r>
         <w:r>
           <w:rPr>
@@ -597,7 +649,7 @@
           <w14:ligatures w14:val="standardContextual"/>
         </w:rPr>
       </w:pPr>
-      <w:hyperlink w:anchor="_Toc228386254" w:history="1">
+      <w:hyperlink w:anchor="_Toc228890757" w:history="1">
         <w:r>
           <w:rPr>
             <w:rStyle w:val="Hyperlink"/>
@@ -648,7 +700,7 @@
             <w:noProof/>
             <w:webHidden/>
           </w:rPr>
-          <w:instrText xml:space="preserve"> PAGEREF _Toc228386254 \h </w:instrText>
+          <w:instrText xml:space="preserve"> PAGEREF _Toc228890757 \h </w:instrText>
         </w:r>
         <w:r>
           <w:rPr>
@@ -692,7 +744,7 @@
           <w14:ligatures w14:val="standardContextual"/>
         </w:rPr>
       </w:pPr>
-      <w:hyperlink w:anchor="_Toc228386255" w:history="1">
+      <w:hyperlink w:anchor="_Toc228890758" w:history="1">
         <w:r>
           <w:rPr>
             <w:rStyle w:val="Hyperlink"/>
@@ -735,7 +787,7 @@
           <w:rPr>
             <w:webHidden/>
           </w:rPr>
-          <w:instrText xml:space="preserve"> PAGEREF _Toc228386255 \h </w:instrText>
+          <w:instrText xml:space="preserve"> PAGEREF _Toc228890758 \h </w:instrText>
         </w:r>
         <w:r>
           <w:rPr>
@@ -775,7 +827,7 @@
           <w14:ligatures w14:val="standardContextual"/>
         </w:rPr>
       </w:pPr>
-      <w:hyperlink w:anchor="_Toc228386256" w:history="1">
+      <w:hyperlink w:anchor="_Toc228890759" w:history="1">
         <w:r>
           <w:rPr>
             <w:rStyle w:val="Hyperlink"/>
@@ -818,7 +870,7 @@
           <w:rPr>
             <w:webHidden/>
           </w:rPr>
-          <w:instrText xml:space="preserve"> PAGEREF _Toc228386256 \h </w:instrText>
+          <w:instrText xml:space="preserve"> PAGEREF _Toc228890759 \h </w:instrText>
         </w:r>
         <w:r>
           <w:rPr>
@@ -858,7 +910,7 @@
           <w14:ligatures w14:val="standardContextual"/>
         </w:rPr>
       </w:pPr>
-      <w:hyperlink w:anchor="_Toc228386257" w:history="1">
+      <w:hyperlink w:anchor="_Toc228890760" w:history="1">
         <w:r>
           <w:rPr>
             <w:rStyle w:val="Hyperlink"/>
@@ -901,7 +953,7 @@
           <w:rPr>
             <w:webHidden/>
           </w:rPr>
-          <w:instrText xml:space="preserve"> PAGEREF _Toc228386257 \h </w:instrText>
+          <w:instrText xml:space="preserve"> PAGEREF _Toc228890760 \h </w:instrText>
         </w:r>
         <w:r>
           <w:rPr>
@@ -918,7 +970,7 @@
           <w:rPr>
             <w:webHidden/>
           </w:rPr>
-          <w:t>3</w:t>
+          <w:t>4</w:t>
         </w:r>
         <w:r>
           <w:rPr>
@@ -941,7 +993,7 @@
           <w14:ligatures w14:val="standardContextual"/>
         </w:rPr>
       </w:pPr>
-      <w:hyperlink w:anchor="_Toc228386258" w:history="1">
+      <w:hyperlink w:anchor="_Toc228890761" w:history="1">
         <w:r>
           <w:rPr>
             <w:rStyle w:val="Hyperlink"/>
@@ -984,7 +1036,7 @@
           <w:rPr>
             <w:webHidden/>
           </w:rPr>
-          <w:instrText xml:space="preserve"> PAGEREF _Toc228386258 \h </w:instrText>
+          <w:instrText xml:space="preserve"> PAGEREF _Toc228890761 \h </w:instrText>
         </w:r>
         <w:r>
           <w:rPr>
@@ -1001,7 +1053,7 @@
           <w:rPr>
             <w:webHidden/>
           </w:rPr>
-          <w:t>3</w:t>
+          <w:t>4</w:t>
         </w:r>
         <w:r>
           <w:rPr>
@@ -1024,7 +1076,7 @@
           <w14:ligatures w14:val="standardContextual"/>
         </w:rPr>
       </w:pPr>
-      <w:hyperlink w:anchor="_Toc228386259" w:history="1">
+      <w:hyperlink w:anchor="_Toc228890762" w:history="1">
         <w:r>
           <w:rPr>
             <w:rStyle w:val="Hyperlink"/>
@@ -1067,7 +1119,7 @@
           <w:rPr>
             <w:webHidden/>
           </w:rPr>
-          <w:instrText xml:space="preserve"> PAGEREF _Toc228386259 \h </w:instrText>
+          <w:instrText xml:space="preserve"> PAGEREF _Toc228890762 \h </w:instrText>
         </w:r>
         <w:r>
           <w:rPr>
@@ -1110,7 +1162,7 @@
           <w14:ligatures w14:val="standardContextual"/>
         </w:rPr>
       </w:pPr>
-      <w:hyperlink w:anchor="_Toc228386260" w:history="1">
+      <w:hyperlink w:anchor="_Toc228890763" w:history="1">
         <w:r>
           <w:rPr>
             <w:rStyle w:val="Hyperlink"/>
@@ -1161,7 +1213,7 @@
             <w:noProof/>
             <w:webHidden/>
           </w:rPr>
-          <w:instrText xml:space="preserve"> PAGEREF _Toc228386260 \h </w:instrText>
+          <w:instrText xml:space="preserve"> PAGEREF _Toc228890763 \h </w:instrText>
         </w:r>
         <w:r>
           <w:rPr>
@@ -1181,7 +1233,7 @@
             <w:noProof/>
             <w:webHidden/>
           </w:rPr>
-          <w:t>4</w:t>
+          <w:t>5</w:t>
         </w:r>
         <w:r>
           <w:rPr>
@@ -1205,7 +1257,7 @@
           <w14:ligatures w14:val="standardContextual"/>
         </w:rPr>
       </w:pPr>
-      <w:hyperlink w:anchor="_Toc228386261" w:history="1">
+      <w:hyperlink w:anchor="_Toc228890764" w:history="1">
         <w:r>
           <w:rPr>
             <w:rStyle w:val="Hyperlink"/>
@@ -1230,7 +1282,7 @@
             <w:rStyle w:val="Hyperlink"/>
             <w:lang w:val="en-US"/>
           </w:rPr>
-          <w:t>Business Requirement (Summary)</w:t>
+          <w:t>Game Summary</w:t>
         </w:r>
         <w:r>
           <w:rPr>
@@ -1248,7 +1300,7 @@
           <w:rPr>
             <w:webHidden/>
           </w:rPr>
-          <w:instrText xml:space="preserve"> PAGEREF _Toc228386261 \h </w:instrText>
+          <w:instrText xml:space="preserve"> PAGEREF _Toc228890764 \h </w:instrText>
         </w:r>
         <w:r>
           <w:rPr>
@@ -1265,7 +1317,7 @@
           <w:rPr>
             <w:webHidden/>
           </w:rPr>
-          <w:t>4</w:t>
+          <w:t>5</w:t>
         </w:r>
         <w:r>
           <w:rPr>
@@ -1288,7 +1340,7 @@
           <w14:ligatures w14:val="standardContextual"/>
         </w:rPr>
       </w:pPr>
-      <w:hyperlink w:anchor="_Toc228386262" w:history="1">
+      <w:hyperlink w:anchor="_Toc228890765" w:history="1">
         <w:r>
           <w:rPr>
             <w:rStyle w:val="Hyperlink"/>
@@ -1331,7 +1383,7 @@
           <w:rPr>
             <w:webHidden/>
           </w:rPr>
-          <w:instrText xml:space="preserve"> PAGEREF _Toc228386262 \h </w:instrText>
+          <w:instrText xml:space="preserve"> PAGEREF _Toc228890765 \h </w:instrText>
         </w:r>
         <w:r>
           <w:rPr>
@@ -1348,7 +1400,7 @@
           <w:rPr>
             <w:webHidden/>
           </w:rPr>
-          <w:t>4</w:t>
+          <w:t>5</w:t>
         </w:r>
         <w:r>
           <w:rPr>
@@ -1374,7 +1426,7 @@
           <w14:ligatures w14:val="standardContextual"/>
         </w:rPr>
       </w:pPr>
-      <w:hyperlink w:anchor="_Toc228386263" w:history="1">
+      <w:hyperlink w:anchor="_Toc228890766" w:history="1">
         <w:r>
           <w:rPr>
             <w:rStyle w:val="Hyperlink"/>
@@ -1425,7 +1477,7 @@
             <w:noProof/>
             <w:webHidden/>
           </w:rPr>
-          <w:instrText xml:space="preserve"> PAGEREF _Toc228386263 \h </w:instrText>
+          <w:instrText xml:space="preserve"> PAGEREF _Toc228890766 \h </w:instrText>
         </w:r>
         <w:r>
           <w:rPr>
@@ -1445,7 +1497,7 @@
             <w:noProof/>
             <w:webHidden/>
           </w:rPr>
-          <w:t>4</w:t>
+          <w:t>6</w:t>
         </w:r>
         <w:r>
           <w:rPr>
@@ -1469,7 +1521,7 @@
           <w14:ligatures w14:val="standardContextual"/>
         </w:rPr>
       </w:pPr>
-      <w:hyperlink w:anchor="_Toc228386264" w:history="1">
+      <w:hyperlink w:anchor="_Toc228890767" w:history="1">
         <w:r>
           <w:rPr>
             <w:rStyle w:val="Hyperlink"/>
@@ -1494,7 +1546,7 @@
             <w:rStyle w:val="Hyperlink"/>
             <w:lang w:val="en-US"/>
           </w:rPr>
-          <w:t>Logical Architecture</w:t>
+          <w:t>Software Architecture</w:t>
         </w:r>
         <w:r>
           <w:rPr>
@@ -1512,7 +1564,7 @@
           <w:rPr>
             <w:webHidden/>
           </w:rPr>
-          <w:instrText xml:space="preserve"> PAGEREF _Toc228386264 \h </w:instrText>
+          <w:instrText xml:space="preserve"> PAGEREF _Toc228890767 \h </w:instrText>
         </w:r>
         <w:r>
           <w:rPr>
@@ -1529,7 +1581,7 @@
           <w:rPr>
             <w:webHidden/>
           </w:rPr>
-          <w:t>4</w:t>
+          <w:t>6</w:t>
         </w:r>
         <w:r>
           <w:rPr>
@@ -1552,7 +1604,7 @@
           <w14:ligatures w14:val="standardContextual"/>
         </w:rPr>
       </w:pPr>
-      <w:hyperlink w:anchor="_Toc228386265" w:history="1">
+      <w:hyperlink w:anchor="_Toc228890768" w:history="1">
         <w:r>
           <w:rPr>
             <w:rStyle w:val="Hyperlink"/>
@@ -1577,7 +1629,7 @@
             <w:rStyle w:val="Hyperlink"/>
             <w:lang w:val="en-US"/>
           </w:rPr>
-          <w:t>Physical Architecture</w:t>
+          <w:t>Technical Architecture</w:t>
         </w:r>
         <w:r>
           <w:rPr>
@@ -1595,7 +1647,7 @@
           <w:rPr>
             <w:webHidden/>
           </w:rPr>
-          <w:instrText xml:space="preserve"> PAGEREF _Toc228386265 \h </w:instrText>
+          <w:instrText xml:space="preserve"> PAGEREF _Toc228890768 \h </w:instrText>
         </w:r>
         <w:r>
           <w:rPr>
@@ -1612,7 +1664,7 @@
           <w:rPr>
             <w:webHidden/>
           </w:rPr>
-          <w:t>4</w:t>
+          <w:t>6</w:t>
         </w:r>
         <w:r>
           <w:rPr>
@@ -1638,7 +1690,7 @@
           <w14:ligatures w14:val="standardContextual"/>
         </w:rPr>
       </w:pPr>
-      <w:hyperlink w:anchor="_Toc228386266" w:history="1">
+      <w:hyperlink w:anchor="_Toc228890769" w:history="1">
         <w:r>
           <w:rPr>
             <w:rStyle w:val="Hyperlink"/>
@@ -1689,7 +1741,7 @@
             <w:noProof/>
             <w:webHidden/>
           </w:rPr>
-          <w:instrText xml:space="preserve"> PAGEREF _Toc228386266 \h </w:instrText>
+          <w:instrText xml:space="preserve"> PAGEREF _Toc228890769 \h </w:instrText>
         </w:r>
         <w:r>
           <w:rPr>
@@ -1709,7 +1761,7 @@
             <w:noProof/>
             <w:webHidden/>
           </w:rPr>
-          <w:t>4</w:t>
+          <w:t>6</w:t>
         </w:r>
         <w:r>
           <w:rPr>
@@ -1733,7 +1785,7 @@
           <w14:ligatures w14:val="standardContextual"/>
         </w:rPr>
       </w:pPr>
-      <w:hyperlink w:anchor="_Toc228386267" w:history="1">
+      <w:hyperlink w:anchor="_Toc228890770" w:history="1">
         <w:r>
           <w:rPr>
             <w:rStyle w:val="Hyperlink"/>
@@ -1776,7 +1828,7 @@
           <w:rPr>
             <w:webHidden/>
           </w:rPr>
-          <w:instrText xml:space="preserve"> PAGEREF _Toc228386267 \h </w:instrText>
+          <w:instrText xml:space="preserve"> PAGEREF _Toc228890770 \h </w:instrText>
         </w:r>
         <w:r>
           <w:rPr>
@@ -1793,7 +1845,7 @@
           <w:rPr>
             <w:webHidden/>
           </w:rPr>
-          <w:t>4</w:t>
+          <w:t>6</w:t>
         </w:r>
         <w:r>
           <w:rPr>
@@ -1816,7 +1868,7 @@
           <w14:ligatures w14:val="standardContextual"/>
         </w:rPr>
       </w:pPr>
-      <w:hyperlink w:anchor="_Toc228386268" w:history="1">
+      <w:hyperlink w:anchor="_Toc228890771" w:history="1">
         <w:r>
           <w:rPr>
             <w:rStyle w:val="Hyperlink"/>
@@ -1859,7 +1911,7 @@
           <w:rPr>
             <w:webHidden/>
           </w:rPr>
-          <w:instrText xml:space="preserve"> PAGEREF _Toc228386268 \h </w:instrText>
+          <w:instrText xml:space="preserve"> PAGEREF _Toc228890771 \h </w:instrText>
         </w:r>
         <w:r>
           <w:rPr>
@@ -1876,7 +1928,7 @@
           <w:rPr>
             <w:webHidden/>
           </w:rPr>
-          <w:t>5</w:t>
+          <w:t>6</w:t>
         </w:r>
         <w:r>
           <w:rPr>
@@ -1902,7 +1954,7 @@
           <w14:ligatures w14:val="standardContextual"/>
         </w:rPr>
       </w:pPr>
-      <w:hyperlink w:anchor="_Toc228386269" w:history="1">
+      <w:hyperlink w:anchor="_Toc228890772" w:history="1">
         <w:r>
           <w:rPr>
             <w:rStyle w:val="Hyperlink"/>
@@ -1953,7 +2005,7 @@
             <w:noProof/>
             <w:webHidden/>
           </w:rPr>
-          <w:instrText xml:space="preserve"> PAGEREF _Toc228386269 \h </w:instrText>
+          <w:instrText xml:space="preserve"> PAGEREF _Toc228890772 \h </w:instrText>
         </w:r>
         <w:r>
           <w:rPr>
@@ -1973,7 +2025,7 @@
             <w:noProof/>
             <w:webHidden/>
           </w:rPr>
-          <w:t>5</w:t>
+          <w:t>7</w:t>
         </w:r>
         <w:r>
           <w:rPr>
@@ -2000,7 +2052,7 @@
           <w14:ligatures w14:val="standardContextual"/>
         </w:rPr>
       </w:pPr>
-      <w:hyperlink w:anchor="_Toc228386270" w:history="1">
+      <w:hyperlink w:anchor="_Toc228890773" w:history="1">
         <w:r>
           <w:rPr>
             <w:rStyle w:val="Hyperlink"/>
@@ -2051,7 +2103,7 @@
             <w:noProof/>
             <w:webHidden/>
           </w:rPr>
-          <w:instrText xml:space="preserve"> PAGEREF _Toc228386270 \h </w:instrText>
+          <w:instrText xml:space="preserve"> PAGEREF _Toc228890773 \h </w:instrText>
         </w:r>
         <w:r>
           <w:rPr>
@@ -2071,7 +2123,7 @@
             <w:noProof/>
             <w:webHidden/>
           </w:rPr>
-          <w:t>5</w:t>
+          <w:t>7</w:t>
         </w:r>
         <w:r>
           <w:rPr>
@@ -2095,7 +2147,7 @@
           <w14:ligatures w14:val="standardContextual"/>
         </w:rPr>
       </w:pPr>
-      <w:hyperlink w:anchor="_Toc228386271" w:history="1">
+      <w:hyperlink w:anchor="_Toc228890774" w:history="1">
         <w:r>
           <w:rPr>
             <w:rStyle w:val="Hyperlink"/>
@@ -2138,7 +2190,7 @@
           <w:rPr>
             <w:webHidden/>
           </w:rPr>
-          <w:instrText xml:space="preserve"> PAGEREF _Toc228386271 \h </w:instrText>
+          <w:instrText xml:space="preserve"> PAGEREF _Toc228890774 \h </w:instrText>
         </w:r>
         <w:r>
           <w:rPr>
@@ -2155,7 +2207,7 @@
           <w:rPr>
             <w:webHidden/>
           </w:rPr>
-          <w:t>5</w:t>
+          <w:t>7</w:t>
         </w:r>
         <w:r>
           <w:rPr>
@@ -2178,7 +2230,7 @@
           <w14:ligatures w14:val="standardContextual"/>
         </w:rPr>
       </w:pPr>
-      <w:hyperlink w:anchor="_Toc228386272" w:history="1">
+      <w:hyperlink w:anchor="_Toc228890775" w:history="1">
         <w:r>
           <w:rPr>
             <w:rStyle w:val="Hyperlink"/>
@@ -2221,7 +2273,7 @@
           <w:rPr>
             <w:webHidden/>
           </w:rPr>
-          <w:instrText xml:space="preserve"> PAGEREF _Toc228386272 \h </w:instrText>
+          <w:instrText xml:space="preserve"> PAGEREF _Toc228890775 \h </w:instrText>
         </w:r>
         <w:r>
           <w:rPr>
@@ -2238,7 +2290,7 @@
           <w:rPr>
             <w:webHidden/>
           </w:rPr>
-          <w:t>5</w:t>
+          <w:t>7</w:t>
         </w:r>
         <w:r>
           <w:rPr>
@@ -2264,7 +2316,7 @@
           <w14:ligatures w14:val="standardContextual"/>
         </w:rPr>
       </w:pPr>
-      <w:hyperlink w:anchor="_Toc228386273" w:history="1">
+      <w:hyperlink w:anchor="_Toc228890776" w:history="1">
         <w:r>
           <w:rPr>
             <w:rStyle w:val="Hyperlink"/>
@@ -2315,7 +2367,7 @@
             <w:noProof/>
             <w:webHidden/>
           </w:rPr>
-          <w:instrText xml:space="preserve"> PAGEREF _Toc228386273 \h </w:instrText>
+          <w:instrText xml:space="preserve"> PAGEREF _Toc228890776 \h </w:instrText>
         </w:r>
         <w:r>
           <w:rPr>
@@ -2335,7 +2387,7 @@
             <w:noProof/>
             <w:webHidden/>
           </w:rPr>
-          <w:t>5</w:t>
+          <w:t>8</w:t>
         </w:r>
         <w:r>
           <w:rPr>
@@ -2359,7 +2411,7 @@
           <w14:ligatures w14:val="standardContextual"/>
         </w:rPr>
       </w:pPr>
-      <w:hyperlink w:anchor="_Toc228386274" w:history="1">
+      <w:hyperlink w:anchor="_Toc228890777" w:history="1">
         <w:r>
           <w:rPr>
             <w:rStyle w:val="Hyperlink"/>
@@ -2402,7 +2454,7 @@
           <w:rPr>
             <w:webHidden/>
           </w:rPr>
-          <w:instrText xml:space="preserve"> PAGEREF _Toc228386274 \h </w:instrText>
+          <w:instrText xml:space="preserve"> PAGEREF _Toc228890777 \h </w:instrText>
         </w:r>
         <w:r>
           <w:rPr>
@@ -2419,7 +2471,7 @@
           <w:rPr>
             <w:webHidden/>
           </w:rPr>
-          <w:t>5</w:t>
+          <w:t>8</w:t>
         </w:r>
         <w:r>
           <w:rPr>
@@ -2442,7 +2494,7 @@
           <w14:ligatures w14:val="standardContextual"/>
         </w:rPr>
       </w:pPr>
-      <w:hyperlink w:anchor="_Toc228386275" w:history="1">
+      <w:hyperlink w:anchor="_Toc228890778" w:history="1">
         <w:r>
           <w:rPr>
             <w:rStyle w:val="Hyperlink"/>
@@ -2485,7 +2537,7 @@
           <w:rPr>
             <w:webHidden/>
           </w:rPr>
-          <w:instrText xml:space="preserve"> PAGEREF _Toc228386275 \h </w:instrText>
+          <w:instrText xml:space="preserve"> PAGEREF _Toc228890778 \h </w:instrText>
         </w:r>
         <w:r>
           <w:rPr>
@@ -2502,7 +2554,7 @@
           <w:rPr>
             <w:webHidden/>
           </w:rPr>
-          <w:t>5</w:t>
+          <w:t>8</w:t>
         </w:r>
         <w:r>
           <w:rPr>
@@ -2528,7 +2580,7 @@
           <w14:ligatures w14:val="standardContextual"/>
         </w:rPr>
       </w:pPr>
-      <w:hyperlink w:anchor="_Toc228386276" w:history="1">
+      <w:hyperlink w:anchor="_Toc228890779" w:history="1">
         <w:r>
           <w:rPr>
             <w:rStyle w:val="Hyperlink"/>
@@ -2579,7 +2631,7 @@
             <w:noProof/>
             <w:webHidden/>
           </w:rPr>
-          <w:instrText xml:space="preserve"> PAGEREF _Toc228386276 \h </w:instrText>
+          <w:instrText xml:space="preserve"> PAGEREF _Toc228890779 \h </w:instrText>
         </w:r>
         <w:r>
           <w:rPr>
@@ -2599,7 +2651,7 @@
             <w:noProof/>
             <w:webHidden/>
           </w:rPr>
-          <w:t>6</w:t>
+          <w:t>8</w:t>
         </w:r>
         <w:r>
           <w:rPr>
@@ -2626,7 +2678,7 @@
           <w14:ligatures w14:val="standardContextual"/>
         </w:rPr>
       </w:pPr>
-      <w:hyperlink w:anchor="_Toc228386277" w:history="1">
+      <w:hyperlink w:anchor="_Toc228890780" w:history="1">
         <w:r>
           <w:rPr>
             <w:rStyle w:val="Hyperlink"/>
@@ -2677,7 +2729,7 @@
             <w:noProof/>
             <w:webHidden/>
           </w:rPr>
-          <w:instrText xml:space="preserve"> PAGEREF _Toc228386277 \h </w:instrText>
+          <w:instrText xml:space="preserve"> PAGEREF _Toc228890780 \h </w:instrText>
         </w:r>
         <w:r>
           <w:rPr>
@@ -2697,11 +2749,269 @@
             <w:noProof/>
             <w:webHidden/>
           </w:rPr>
-          <w:t>6</w:t>
+          <w:t>8</w:t>
         </w:r>
         <w:r>
           <w:rPr>
             <w:noProof/>
+            <w:webHidden/>
+          </w:rPr>
+          <w:fldChar w:fldCharType="end"/>
+        </w:r>
+      </w:hyperlink>
+    </w:p>
+    <w:p>
+      <w:pPr>
+        <w:pStyle w:val="TOC1"/>
+        <w:rPr>
+          <w:rFonts w:asciiTheme="minorHAnsi" w:eastAsiaTheme="minorEastAsia" w:hAnsiTheme="minorHAnsi" w:cstheme="minorBidi"/>
+          <w:b w:val="0"/>
+          <w:bCs w:val="0"/>
+          <w:caps w:val="0"/>
+          <w:noProof/>
+          <w:kern w:val="2"/>
+          <w:sz w:val="24"/>
+          <w:szCs w:val="24"/>
+          <w:lang w:val="en-US"/>
+          <w14:ligatures w14:val="standardContextual"/>
+        </w:rPr>
+      </w:pPr>
+      <w:hyperlink w:anchor="_Toc228890781" w:history="1">
+        <w:r>
+          <w:rPr>
+            <w:rStyle w:val="Hyperlink"/>
+            <w:noProof/>
+          </w:rPr>
+          <w:t>11</w:t>
+        </w:r>
+        <w:r>
+          <w:rPr>
+            <w:rFonts w:asciiTheme="minorHAnsi" w:eastAsiaTheme="minorEastAsia" w:hAnsiTheme="minorHAnsi" w:cstheme="minorBidi"/>
+            <w:b w:val="0"/>
+            <w:bCs w:val="0"/>
+            <w:caps w:val="0"/>
+            <w:noProof/>
+            <w:kern w:val="2"/>
+            <w:sz w:val="24"/>
+            <w:szCs w:val="24"/>
+            <w:lang w:val="en-US"/>
+            <w14:ligatures w14:val="standardContextual"/>
+          </w:rPr>
+          <w:tab/>
+        </w:r>
+        <w:r>
+          <w:rPr>
+            <w:rStyle w:val="Hyperlink"/>
+            <w:noProof/>
+          </w:rPr>
+          <w:t>Document Management</w:t>
+        </w:r>
+        <w:r>
+          <w:rPr>
+            <w:noProof/>
+            <w:webHidden/>
+          </w:rPr>
+          <w:tab/>
+        </w:r>
+        <w:r>
+          <w:rPr>
+            <w:noProof/>
+            <w:webHidden/>
+          </w:rPr>
+          <w:fldChar w:fldCharType="begin"/>
+        </w:r>
+        <w:r>
+          <w:rPr>
+            <w:noProof/>
+            <w:webHidden/>
+          </w:rPr>
+          <w:instrText xml:space="preserve"> PAGEREF _Toc228890781 \h </w:instrText>
+        </w:r>
+        <w:r>
+          <w:rPr>
+            <w:noProof/>
+            <w:webHidden/>
+          </w:rPr>
+        </w:r>
+        <w:r>
+          <w:rPr>
+            <w:noProof/>
+            <w:webHidden/>
+          </w:rPr>
+          <w:fldChar w:fldCharType="separate"/>
+        </w:r>
+        <w:r>
+          <w:rPr>
+            <w:noProof/>
+            <w:webHidden/>
+          </w:rPr>
+          <w:t>8</w:t>
+        </w:r>
+        <w:r>
+          <w:rPr>
+            <w:noProof/>
+            <w:webHidden/>
+          </w:rPr>
+          <w:fldChar w:fldCharType="end"/>
+        </w:r>
+      </w:hyperlink>
+    </w:p>
+    <w:p>
+      <w:pPr>
+        <w:pStyle w:val="TOC2"/>
+        <w:rPr>
+          <w:rFonts w:asciiTheme="minorHAnsi" w:eastAsiaTheme="minorEastAsia" w:hAnsiTheme="minorHAnsi" w:cstheme="minorBidi"/>
+          <w:b w:val="0"/>
+          <w:bCs w:val="0"/>
+          <w:kern w:val="2"/>
+          <w:sz w:val="24"/>
+          <w:lang w:val="en-US"/>
+          <w14:ligatures w14:val="standardContextual"/>
+        </w:rPr>
+      </w:pPr>
+      <w:hyperlink w:anchor="_Toc228890782" w:history="1">
+        <w:r>
+          <w:rPr>
+            <w:rStyle w:val="Hyperlink"/>
+          </w:rPr>
+          <w:t>11.1</w:t>
+        </w:r>
+        <w:r>
+          <w:rPr>
+            <w:rFonts w:asciiTheme="minorHAnsi" w:eastAsiaTheme="minorEastAsia" w:hAnsiTheme="minorHAnsi" w:cstheme="minorBidi"/>
+            <w:b w:val="0"/>
+            <w:bCs w:val="0"/>
+            <w:kern w:val="2"/>
+            <w:sz w:val="24"/>
+            <w:lang w:val="en-US"/>
+            <w14:ligatures w14:val="standardContextual"/>
+          </w:rPr>
+          <w:tab/>
+        </w:r>
+        <w:r>
+          <w:rPr>
+            <w:rStyle w:val="Hyperlink"/>
+          </w:rPr>
+          <w:t>Contributors</w:t>
+        </w:r>
+        <w:r>
+          <w:rPr>
+            <w:webHidden/>
+          </w:rPr>
+          <w:tab/>
+        </w:r>
+        <w:r>
+          <w:rPr>
+            <w:webHidden/>
+          </w:rPr>
+          <w:fldChar w:fldCharType="begin"/>
+        </w:r>
+        <w:r>
+          <w:rPr>
+            <w:webHidden/>
+          </w:rPr>
+          <w:instrText xml:space="preserve"> PAGEREF _Toc228890782 \h </w:instrText>
+        </w:r>
+        <w:r>
+          <w:rPr>
+            <w:webHidden/>
+          </w:rPr>
+        </w:r>
+        <w:r>
+          <w:rPr>
+            <w:webHidden/>
+          </w:rPr>
+          <w:fldChar w:fldCharType="separate"/>
+        </w:r>
+        <w:r>
+          <w:rPr>
+            <w:webHidden/>
+          </w:rPr>
+          <w:t>8</w:t>
+        </w:r>
+        <w:r>
+          <w:rPr>
+            <w:webHidden/>
+          </w:rPr>
+          <w:fldChar w:fldCharType="end"/>
+        </w:r>
+      </w:hyperlink>
+    </w:p>
+    <w:p>
+      <w:pPr>
+        <w:pStyle w:val="TOC2"/>
+        <w:rPr>
+          <w:rFonts w:asciiTheme="minorHAnsi" w:eastAsiaTheme="minorEastAsia" w:hAnsiTheme="minorHAnsi" w:cstheme="minorBidi"/>
+          <w:b w:val="0"/>
+          <w:bCs w:val="0"/>
+          <w:kern w:val="2"/>
+          <w:sz w:val="24"/>
+          <w:lang w:val="en-US"/>
+          <w14:ligatures w14:val="standardContextual"/>
+        </w:rPr>
+      </w:pPr>
+      <w:hyperlink w:anchor="_Toc228890783" w:history="1">
+        <w:r>
+          <w:rPr>
+            <w:rStyle w:val="Hyperlink"/>
+          </w:rPr>
+          <w:t>11.2</w:t>
+        </w:r>
+        <w:r>
+          <w:rPr>
+            <w:rFonts w:asciiTheme="minorHAnsi" w:eastAsiaTheme="minorEastAsia" w:hAnsiTheme="minorHAnsi" w:cstheme="minorBidi"/>
+            <w:b w:val="0"/>
+            <w:bCs w:val="0"/>
+            <w:kern w:val="2"/>
+            <w:sz w:val="24"/>
+            <w:lang w:val="en-US"/>
+            <w14:ligatures w14:val="standardContextual"/>
+          </w:rPr>
+          <w:tab/>
+        </w:r>
+        <w:r>
+          <w:rPr>
+            <w:rStyle w:val="Hyperlink"/>
+          </w:rPr>
+          <w:t>Version Control</w:t>
+        </w:r>
+        <w:r>
+          <w:rPr>
+            <w:webHidden/>
+          </w:rPr>
+          <w:tab/>
+        </w:r>
+        <w:r>
+          <w:rPr>
+            <w:webHidden/>
+          </w:rPr>
+          <w:fldChar w:fldCharType="begin"/>
+        </w:r>
+        <w:r>
+          <w:rPr>
+            <w:webHidden/>
+          </w:rPr>
+          <w:instrText xml:space="preserve"> PAGEREF _Toc228890783 \h </w:instrText>
+        </w:r>
+        <w:r>
+          <w:rPr>
+            <w:webHidden/>
+          </w:rPr>
+        </w:r>
+        <w:r>
+          <w:rPr>
+            <w:webHidden/>
+          </w:rPr>
+          <w:fldChar w:fldCharType="separate"/>
+        </w:r>
+        <w:r>
+          <w:rPr>
+            <w:webHidden/>
+          </w:rPr>
+          <w:t>8</w:t>
+        </w:r>
+        <w:r>
+          <w:rPr>
             <w:webHidden/>
           </w:rPr>
           <w:fldChar w:fldCharType="end"/>
@@ -2736,7 +3046,7 @@
           <w:lang w:val="en-US"/>
         </w:rPr>
       </w:pPr>
-      <w:bookmarkStart w:id="0" w:name="_Toc228386250"/>
+      <w:bookmarkStart w:id="0" w:name="_Toc228890753"/>
       <w:r>
         <w:rPr>
           <w:lang w:val="en-US"/>
@@ -2758,7 +3068,7 @@
           <w:lang w:val="en-US"/>
         </w:rPr>
       </w:pPr>
-      <w:bookmarkStart w:id="1" w:name="_Toc228386251"/>
+      <w:bookmarkStart w:id="1" w:name="_Toc228890754"/>
       <w:r>
         <w:rPr>
           <w:lang w:val="en-US"/>
@@ -2805,7 +3115,7 @@
           <w:lang w:val="en-US"/>
         </w:rPr>
       </w:pPr>
-      <w:bookmarkStart w:id="2" w:name="_Toc228386252"/>
+      <w:bookmarkStart w:id="2" w:name="_Toc228890755"/>
       <w:r>
         <w:rPr>
           <w:lang w:val="en-US"/>
@@ -2948,7 +3258,7 @@
           <w:lang w:val="en-US"/>
         </w:rPr>
       </w:pPr>
-      <w:bookmarkStart w:id="3" w:name="_Toc228386253"/>
+      <w:bookmarkStart w:id="3" w:name="_Toc228890756"/>
       <w:r>
         <w:rPr>
           <w:lang w:val="en-US"/>
@@ -3019,7 +3329,7 @@
           <w:lang w:val="en-US"/>
         </w:rPr>
       </w:pPr>
-      <w:bookmarkStart w:id="4" w:name="_Toc228386254"/>
+      <w:bookmarkStart w:id="4" w:name="_Toc228890757"/>
       <w:r>
         <w:rPr>
           <w:lang w:val="en-US"/>
@@ -3040,7 +3350,7 @@
           <w:lang w:val="en-US"/>
         </w:rPr>
       </w:pPr>
-      <w:bookmarkStart w:id="5" w:name="_Toc228386255"/>
+      <w:bookmarkStart w:id="5" w:name="_Toc228890758"/>
       <w:r>
         <w:rPr>
           <w:lang w:val="en-US"/>
@@ -3159,23 +3469,36 @@
     </w:p>
     <w:p>
       <w:pPr>
-        <w:ind w:left="360"/>
+        <w:ind w:left="720"/>
         <w:rPr>
           <w:lang w:val="en-US"/>
         </w:rPr>
       </w:pPr>
       <w:r>
         <w:rPr>
-          <w:b/>
-          <w:bCs/>
-          <w:highlight w:val="yellow"/>
-          <w:lang w:val="en-US"/>
-        </w:rPr>
-        <w:t>BOOKMARK: ADD EXACT FILE NAME OR PATH</w:t>
+          <w:lang w:val="en-US"/>
+        </w:rPr>
+        <w:t>Download GameMaker from:</w:t>
       </w:r>
     </w:p>
     <w:p>
       <w:pPr>
+        <w:ind w:left="720"/>
+        <w:rPr>
+          <w:lang w:val="en-US"/>
+        </w:rPr>
+      </w:pPr>
+      <w:hyperlink r:id="rId8" w:history="1">
+        <w:r>
+          <w:rPr>
+            <w:rStyle w:val="Hyperlink"/>
+          </w:rPr>
+          <w:t>https://gamemaker.io/en</w:t>
+        </w:r>
+      </w:hyperlink>
+    </w:p>
+    <w:p>
+      <w:pPr>
         <w:pStyle w:val="Heading2"/>
         <w:tabs>
           <w:tab w:val="clear" w:pos="576"/>
@@ -3186,7 +3509,7 @@
           <w:lang w:val="en-US"/>
         </w:rPr>
       </w:pPr>
-      <w:bookmarkStart w:id="6" w:name="_Toc228386256"/>
+      <w:bookmarkStart w:id="6" w:name="_Toc228890759"/>
       <w:r>
         <w:rPr>
           <w:lang w:val="en-US"/>
@@ -3255,31 +3578,92 @@
     </w:p>
     <w:p>
       <w:pPr>
-        <w:ind w:left="360"/>
-        <w:rPr>
-          <w:lang w:val="en-US"/>
-        </w:rPr>
-      </w:pPr>
-    </w:p>
-    <w:p>
-      <w:pPr>
-        <w:ind w:left="360"/>
+        <w:pStyle w:val="ListParagraph"/>
+        <w:numPr>
+          <w:ilvl w:val="0"/>
+          <w:numId w:val="95"/>
+        </w:numPr>
         <w:rPr>
           <w:lang w:val="en-US"/>
         </w:rPr>
       </w:pPr>
       <w:r>
         <w:rPr>
-          <w:b/>
-          <w:bCs/>
-          <w:highlight w:val="yellow"/>
-          <w:lang w:val="en-US"/>
-        </w:rPr>
-        <w:t>BOOKMARK: CONFIRM ENTRY OBJECT/ROOM</w:t>
+          <w:lang w:val="en-US"/>
+        </w:rPr>
+        <w:t>Image 2.2</w:t>
+      </w:r>
+      <w:r>
+        <w:rPr>
+          <w:lang w:val="en-US"/>
+        </w:rPr>
+        <w:tab/>
       </w:r>
     </w:p>
     <w:p>
       <w:pPr>
+        <w:ind w:left="2880"/>
+        <w:rPr>
+          <w:lang w:val="en-US"/>
+        </w:rPr>
+      </w:pPr>
+      <w:r>
+        <w:rPr>
+          <w:lang w:val="en-US"/>
+        </w:rPr>
+        <w:drawing>
+          <wp:inline distT="0" distB="0" distL="0" distR="0" wp14:anchorId="18BE7F8B" wp14:editId="43BA9864">
+            <wp:extent cx="2331720" cy="1819656"/>
+            <wp:effectExtent l="0" t="0" r="0" b="9525"/>
+            <wp:docPr id="1845995399" name="Picture 1"/>
+            <wp:cNvGraphicFramePr>
+              <a:graphicFrameLocks xmlns:a="http://schemas.openxmlformats.org/drawingml/2006/main" noChangeAspect="1"/>
+            </wp:cNvGraphicFramePr>
+            <a:graphic xmlns:a="http://schemas.openxmlformats.org/drawingml/2006/main">
+              <a:graphicData uri="http://schemas.openxmlformats.org/drawingml/2006/picture">
+                <pic:pic xmlns:pic="http://schemas.openxmlformats.org/drawingml/2006/picture">
+                  <pic:nvPicPr>
+                    <pic:cNvPr id="1845995399" name=""/>
+                    <pic:cNvPicPr/>
+                  </pic:nvPicPr>
+                  <pic:blipFill>
+                    <a:blip r:embed="rId9" cstate="print">
+                      <a:extLst>
+                        <a:ext uri="{28A0092B-C50C-407E-A947-70E740481C1C}">
+                          <a14:useLocalDpi xmlns:a14="http://schemas.microsoft.com/office/drawing/2010/main" val="0"/>
+                        </a:ext>
+                      </a:extLst>
+                    </a:blip>
+                    <a:stretch>
+                      <a:fillRect/>
+                    </a:stretch>
+                  </pic:blipFill>
+                  <pic:spPr>
+                    <a:xfrm>
+                      <a:off x="0" y="0"/>
+                      <a:ext cx="2331720" cy="1819656"/>
+                    </a:xfrm>
+                    <a:prstGeom prst="rect">
+                      <a:avLst/>
+                    </a:prstGeom>
+                  </pic:spPr>
+                </pic:pic>
+              </a:graphicData>
+            </a:graphic>
+          </wp:inline>
+        </w:drawing>
+      </w:r>
+    </w:p>
+    <w:p>
+      <w:pPr>
+        <w:ind w:left="720"/>
+        <w:rPr>
+          <w:lang w:val="en-US"/>
+        </w:rPr>
+      </w:pPr>
+    </w:p>
+    <w:p>
+      <w:pPr>
         <w:pStyle w:val="Heading2"/>
         <w:tabs>
           <w:tab w:val="clear" w:pos="576"/>
@@ -3290,11 +3674,12 @@
           <w:lang w:val="en-US"/>
         </w:rPr>
       </w:pPr>
-      <w:bookmarkStart w:id="7" w:name="_Toc228386257"/>
+      <w:bookmarkStart w:id="7" w:name="_Toc228890760"/>
       <w:r>
         <w:rPr>
           <w:lang w:val="en-US"/>
         </w:rPr>
+        <w:lastRenderedPageBreak/>
         <w:t>Logic Flow</w:t>
       </w:r>
       <w:bookmarkEnd w:id="7"/>
@@ -3453,32 +3838,6 @@
     </w:p>
     <w:p>
       <w:pPr>
-        <w:ind w:left="360"/>
-        <w:rPr>
-          <w:lang w:val="en-US"/>
-        </w:rPr>
-      </w:pPr>
-    </w:p>
-    <w:p>
-      <w:pPr>
-        <w:ind w:left="360"/>
-        <w:rPr>
-          <w:lang w:val="en-US"/>
-        </w:rPr>
-      </w:pPr>
-      <w:r>
-        <w:rPr>
-          <w:b/>
-          <w:bCs/>
-          <w:highlight w:val="yellow"/>
-          <w:lang w:val="en-US"/>
-        </w:rPr>
-        <w:lastRenderedPageBreak/>
-        <w:t>BOOKMARK: INSERT SEQUENCE DIAGRAM</w:t>
-      </w:r>
-    </w:p>
-    <w:p>
-      <w:pPr>
         <w:pStyle w:val="Heading2"/>
         <w:tabs>
           <w:tab w:val="clear" w:pos="576"/>
@@ -3489,7 +3848,7 @@
           <w:lang w:val="en-US"/>
         </w:rPr>
       </w:pPr>
-      <w:bookmarkStart w:id="8" w:name="_Toc228386258"/>
+      <w:bookmarkStart w:id="8" w:name="_Toc228890761"/>
       <w:r>
         <w:rPr>
           <w:lang w:val="en-US"/>
@@ -3554,31 +3913,6 @@
     </w:p>
     <w:p>
       <w:pPr>
-        <w:ind w:left="360"/>
-        <w:rPr>
-          <w:lang w:val="en-US"/>
-        </w:rPr>
-      </w:pPr>
-    </w:p>
-    <w:p>
-      <w:pPr>
-        <w:ind w:left="360"/>
-        <w:rPr>
-          <w:lang w:val="en-US"/>
-        </w:rPr>
-      </w:pPr>
-      <w:r>
-        <w:rPr>
-          <w:b/>
-          <w:bCs/>
-          <w:highlight w:val="yellow"/>
-          <w:lang w:val="en-US"/>
-        </w:rPr>
-        <w:t>BOOKMARK: ADD SPECIFIC ERROR HANDLING CASES</w:t>
-      </w:r>
-    </w:p>
-    <w:p>
-      <w:pPr>
         <w:pStyle w:val="Heading2"/>
         <w:tabs>
           <w:tab w:val="clear" w:pos="576"/>
@@ -3589,7 +3923,7 @@
           <w:lang w:val="en-US"/>
         </w:rPr>
       </w:pPr>
-      <w:bookmarkStart w:id="9" w:name="_Toc228386259"/>
+      <w:bookmarkStart w:id="9" w:name="_Toc228890762"/>
       <w:r>
         <w:rPr>
           <w:lang w:val="en-US"/>
@@ -3654,27 +3988,15 @@
     </w:p>
     <w:p>
       <w:pPr>
-        <w:ind w:left="360"/>
-        <w:rPr>
-          <w:lang w:val="en-US"/>
-        </w:rPr>
-      </w:pPr>
-    </w:p>
-    <w:p>
-      <w:pPr>
-        <w:ind w:left="360"/>
         <w:rPr>
           <w:lang w:val="en-US"/>
         </w:rPr>
       </w:pPr>
       <w:r>
         <w:rPr>
-          <w:b/>
-          <w:bCs/>
-          <w:highlight w:val="yellow"/>
-          <w:lang w:val="en-US"/>
-        </w:rPr>
-        <w:t>BOOKMARK: ADD TEAM-SPECIFIC NAMING RULES</w:t>
+          <w:lang w:val="en-US"/>
+        </w:rPr>
+        <w:br w:type="page"/>
       </w:r>
     </w:p>
     <w:p>
@@ -3685,11 +4007,12 @@
           <w:lang w:val="en-US"/>
         </w:rPr>
       </w:pPr>
-      <w:bookmarkStart w:id="10" w:name="_Toc228386260"/>
+      <w:bookmarkStart w:id="10" w:name="_Toc228890763"/>
       <w:r>
         <w:rPr>
           <w:lang w:val="en-US"/>
         </w:rPr>
+        <w:lastRenderedPageBreak/>
         <w:t>Product Documentation</w:t>
       </w:r>
       <w:bookmarkEnd w:id="10"/>
@@ -3706,12 +4029,18 @@
           <w:lang w:val="en-US"/>
         </w:rPr>
       </w:pPr>
-      <w:bookmarkStart w:id="11" w:name="_Toc228386261"/>
+      <w:bookmarkStart w:id="11" w:name="_Toc228890764"/>
       <w:r>
         <w:rPr>
           <w:lang w:val="en-US"/>
         </w:rPr>
-        <w:t>Business Requirement (Summary)</w:t>
+        <w:t xml:space="preserve">Game </w:t>
+      </w:r>
+      <w:r>
+        <w:rPr>
+          <w:lang w:val="en-US"/>
+        </w:rPr>
+        <w:t>Summary</w:t>
       </w:r>
       <w:bookmarkEnd w:id="11"/>
     </w:p>
@@ -3726,7 +4055,13 @@
         <w:rPr>
           <w:lang w:val="en-US"/>
         </w:rPr>
-        <w:t>The system provides an interactive gameplay experience where users must manage sleep progression while responding to threats.</w:t>
+        <w:t>The system provides an interactive gameplay experience where users must manage sleep progression while responding to threats</w:t>
+      </w:r>
+      <w:r>
+        <w:rPr>
+          <w:lang w:val="en-US"/>
+        </w:rPr>
+        <w:t xml:space="preserve"> from monsters.</w:t>
       </w:r>
     </w:p>
     <w:p>
@@ -3741,7 +4076,7 @@
           <w:lang w:val="en-US"/>
         </w:rPr>
       </w:pPr>
-      <w:bookmarkStart w:id="12" w:name="_Toc228386262"/>
+      <w:bookmarkStart w:id="12" w:name="_Toc228890765"/>
       <w:r>
         <w:rPr>
           <w:lang w:val="en-US"/>
@@ -3876,38 +4211,109 @@
     </w:p>
     <w:p>
       <w:pPr>
+        <w:pStyle w:val="ListParagraph"/>
+        <w:numPr>
+          <w:ilvl w:val="0"/>
+          <w:numId w:val="99"/>
+        </w:numPr>
         <w:ind w:left="1440"/>
         <w:rPr>
           <w:lang w:val="en-US"/>
         </w:rPr>
       </w:pPr>
-    </w:p>
-    <w:p>
-      <w:pPr>
-        <w:ind w:left="360"/>
-        <w:rPr>
-          <w:lang w:val="en-US"/>
-        </w:rPr>
-      </w:pPr>
       <w:r>
         <w:rPr>
-          <w:b/>
-          <w:bCs/>
-          <w:highlight w:val="yellow"/>
-          <w:lang w:val="en-US"/>
-        </w:rPr>
-        <w:t>BOOKMARK: ADD USE CASE DIAGRAM</w:t>
+          <w:lang w:val="en-US"/>
+        </w:rPr>
+        <w:t>Use Case Diagram 3.2</w:t>
       </w:r>
     </w:p>
     <w:p>
       <w:pPr>
+        <w:ind w:left="1440"/>
+        <w:rPr>
+          <w:lang w:val="en-US"/>
+        </w:rPr>
+      </w:pPr>
+      <w:r>
+        <w:rPr>
+          <w:lang w:val="en-US"/>
+        </w:rPr>
+        <w:drawing>
+          <wp:inline distT="0" distB="0" distL="0" distR="0" wp14:anchorId="229939EB" wp14:editId="360ECD4D">
+            <wp:extent cx="2263336" cy="4054191"/>
+            <wp:effectExtent l="0" t="0" r="3810" b="3810"/>
+            <wp:docPr id="922741377" name="Picture 1"/>
+            <wp:cNvGraphicFramePr>
+              <a:graphicFrameLocks xmlns:a="http://schemas.openxmlformats.org/drawingml/2006/main" noChangeAspect="1"/>
+            </wp:cNvGraphicFramePr>
+            <a:graphic xmlns:a="http://schemas.openxmlformats.org/drawingml/2006/main">
+              <a:graphicData uri="http://schemas.openxmlformats.org/drawingml/2006/picture">
+                <pic:pic xmlns:pic="http://schemas.openxmlformats.org/drawingml/2006/picture">
+                  <pic:nvPicPr>
+                    <pic:cNvPr id="922741377" name=""/>
+                    <pic:cNvPicPr/>
+                  </pic:nvPicPr>
+                  <pic:blipFill>
+                    <a:blip r:embed="rId10"/>
+                    <a:stretch>
+                      <a:fillRect/>
+                    </a:stretch>
+                  </pic:blipFill>
+                  <pic:spPr>
+                    <a:xfrm>
+                      <a:off x="0" y="0"/>
+                      <a:ext cx="2263336" cy="4054191"/>
+                    </a:xfrm>
+                    <a:prstGeom prst="rect">
+                      <a:avLst/>
+                    </a:prstGeom>
+                  </pic:spPr>
+                </pic:pic>
+              </a:graphicData>
+            </a:graphic>
+          </wp:inline>
+        </w:drawing>
+      </w:r>
+    </w:p>
+    <w:p>
+      <w:pPr>
+        <w:ind w:left="1440"/>
+        <w:rPr>
+          <w:lang w:val="en-US"/>
+        </w:rPr>
+      </w:pPr>
+    </w:p>
+    <w:p>
+      <w:pPr>
+        <w:rPr>
+          <w:lang w:val="en-US"/>
+        </w:rPr>
+      </w:pPr>
+      <w:r>
+        <w:rPr>
+          <w:lang w:val="en-US"/>
+        </w:rPr>
+        <w:br w:type="page"/>
+      </w:r>
+    </w:p>
+    <w:p>
+      <w:pPr>
+        <w:ind w:left="1440"/>
+        <w:rPr>
+          <w:lang w:val="en-US"/>
+        </w:rPr>
+      </w:pPr>
+    </w:p>
+    <w:p>
+      <w:pPr>
         <w:pStyle w:val="Heading1"/>
         <w:spacing w:before="240" w:after="120"/>
         <w:rPr>
           <w:lang w:val="en-US"/>
         </w:rPr>
       </w:pPr>
-      <w:bookmarkStart w:id="13" w:name="_Toc228386263"/>
+      <w:bookmarkStart w:id="13" w:name="_Toc228890766"/>
       <w:r>
         <w:rPr>
           <w:lang w:val="en-US"/>
@@ -3934,12 +4340,18 @@
         </w:rPr>
         <w:t xml:space="preserve"> </w:t>
       </w:r>
-      <w:bookmarkStart w:id="14" w:name="_Toc228386264"/>
+      <w:bookmarkStart w:id="14" w:name="_Toc228890767"/>
       <w:r>
         <w:rPr>
           <w:lang w:val="en-US"/>
         </w:rPr>
-        <w:t>Logical Architecture</w:t>
+        <w:t>Software</w:t>
+      </w:r>
+      <w:r>
+        <w:rPr>
+          <w:lang w:val="en-US"/>
+        </w:rPr>
+        <w:t xml:space="preserve"> Architecture</w:t>
       </w:r>
       <w:bookmarkEnd w:id="14"/>
     </w:p>
@@ -3994,7 +4406,7 @@
         <w:rPr>
           <w:lang w:val="en-US"/>
         </w:rPr>
-        <w:t>Sleep Meter System</w:t>
+        <w:t>Sleep Meter</w:t>
       </w:r>
     </w:p>
     <w:p>
@@ -4012,7 +4424,13 @@
         <w:rPr>
           <w:lang w:val="en-US"/>
         </w:rPr>
-        <w:t>Monster System</w:t>
+        <w:t>Monster</w:t>
+      </w:r>
+      <w:r>
+        <w:rPr>
+          <w:lang w:val="en-US"/>
+        </w:rPr>
+        <w:t>s</w:t>
       </w:r>
     </w:p>
     <w:p>
@@ -4030,7 +4448,7 @@
         <w:rPr>
           <w:lang w:val="en-US"/>
         </w:rPr>
-        <w:t>Environmental System</w:t>
+        <w:t>Environment</w:t>
       </w:r>
     </w:p>
     <w:p>
@@ -4048,7 +4466,7 @@
         <w:rPr>
           <w:lang w:val="en-US"/>
         </w:rPr>
-        <w:t>Level Progression System</w:t>
+        <w:t>Level Progression</w:t>
       </w:r>
     </w:p>
     <w:p>
@@ -4066,7 +4484,7 @@
         <w:rPr>
           <w:lang w:val="en-US"/>
         </w:rPr>
-        <w:t>UI System</w:t>
+        <w:t>UI</w:t>
       </w:r>
     </w:p>
     <w:p>
@@ -4084,36 +4502,17 @@
         <w:rPr>
           <w:lang w:val="en-US"/>
         </w:rPr>
-        <w:t>Audio System</w:t>
+        <w:t>Audio</w:t>
+      </w:r>
+      <w:r>
+        <w:rPr>
+          <w:lang w:val="en-US"/>
+        </w:rPr>
+        <w:t xml:space="preserve"> / sound effects</w:t>
       </w:r>
     </w:p>
     <w:p>
       <w:pPr>
-        <w:ind w:left="450"/>
-        <w:rPr>
-          <w:lang w:val="en-US"/>
-        </w:rPr>
-      </w:pPr>
-    </w:p>
-    <w:p>
-      <w:pPr>
-        <w:ind w:left="360"/>
-        <w:rPr>
-          <w:lang w:val="en-US"/>
-        </w:rPr>
-      </w:pPr>
-      <w:r>
-        <w:rPr>
-          <w:b/>
-          <w:bCs/>
-          <w:highlight w:val="yellow"/>
-          <w:lang w:val="en-US"/>
-        </w:rPr>
-        <w:t>BOOKMARK: INSERT LOGICAL ARCHITECTURE DIAGRAM</w:t>
-      </w:r>
-    </w:p>
-    <w:p>
-      <w:pPr>
         <w:pStyle w:val="Heading2"/>
         <w:tabs>
           <w:tab w:val="clear" w:pos="576"/>
@@ -4124,12 +4523,18 @@
           <w:lang w:val="en-US"/>
         </w:rPr>
       </w:pPr>
-      <w:bookmarkStart w:id="15" w:name="_Toc228386265"/>
+      <w:bookmarkStart w:id="15" w:name="_Toc228890768"/>
       <w:r>
         <w:rPr>
           <w:lang w:val="en-US"/>
         </w:rPr>
-        <w:t>Physical Architecture</w:t>
+        <w:t>Technical</w:t>
+      </w:r>
+      <w:r>
+        <w:rPr>
+          <w:lang w:val="en-US"/>
+        </w:rPr>
+        <w:t xml:space="preserve"> Architecture</w:t>
       </w:r>
       <w:bookmarkEnd w:id="15"/>
     </w:p>
@@ -4166,7 +4571,6 @@
         <w:rPr>
           <w:lang w:val="en-US"/>
         </w:rPr>
-        <w:lastRenderedPageBreak/>
         <w:t>Built using GameMaker Studio 2</w:t>
       </w:r>
     </w:p>
@@ -4196,7 +4600,7 @@
           <w:lang w:val="en-US"/>
         </w:rPr>
       </w:pPr>
-      <w:bookmarkStart w:id="16" w:name="_Toc228386266"/>
+      <w:bookmarkStart w:id="16" w:name="_Toc228890769"/>
       <w:r>
         <w:rPr>
           <w:lang w:val="en-US"/>
@@ -4223,7 +4627,7 @@
         </w:rPr>
         <w:t xml:space="preserve"> </w:t>
       </w:r>
-      <w:bookmarkStart w:id="17" w:name="_Toc228386267"/>
+      <w:bookmarkStart w:id="17" w:name="_Toc228890770"/>
       <w:r>
         <w:rPr>
           <w:lang w:val="en-US"/>
@@ -4322,7 +4726,7 @@
         </w:rPr>
         <w:t xml:space="preserve"> </w:t>
       </w:r>
-      <w:bookmarkStart w:id="18" w:name="_Toc228386268"/>
+      <w:bookmarkStart w:id="18" w:name="_Toc228890771"/>
       <w:r>
         <w:rPr>
           <w:lang w:val="en-US"/>
@@ -4467,27 +4871,15 @@
     </w:p>
     <w:p>
       <w:pPr>
-        <w:ind w:left="360"/>
-        <w:rPr>
-          <w:lang w:val="en-US"/>
-        </w:rPr>
-      </w:pPr>
-    </w:p>
-    <w:p>
-      <w:pPr>
-        <w:ind w:left="360"/>
         <w:rPr>
           <w:lang w:val="en-US"/>
         </w:rPr>
       </w:pPr>
       <w:r>
         <w:rPr>
-          <w:b/>
-          <w:bCs/>
-          <w:highlight w:val="yellow"/>
-          <w:lang w:val="en-US"/>
-        </w:rPr>
-        <w:t>BOOKMARK: ADD DATA MODEL DIAGRAM</w:t>
+          <w:lang w:val="en-US"/>
+        </w:rPr>
+        <w:br w:type="page"/>
       </w:r>
     </w:p>
     <w:p>
@@ -4498,11 +4890,12 @@
           <w:lang w:val="en-US"/>
         </w:rPr>
       </w:pPr>
-      <w:bookmarkStart w:id="19" w:name="_Toc228386269"/>
+      <w:bookmarkStart w:id="19" w:name="_Toc228890772"/>
       <w:r>
         <w:rPr>
           <w:lang w:val="en-US"/>
         </w:rPr>
+        <w:lastRenderedPageBreak/>
         <w:t>Sequence and Flow Diagrams</w:t>
       </w:r>
       <w:bookmarkEnd w:id="19"/>
@@ -4518,7 +4911,13 @@
         <w:rPr>
           <w:lang w:val="en-US"/>
         </w:rPr>
-        <w:t>This section should include diagrams that describe:</w:t>
+        <w:t>Diagram for</w:t>
+      </w:r>
+      <w:r>
+        <w:rPr>
+          <w:lang w:val="en-US"/>
+        </w:rPr>
+        <w:t>:</w:t>
       </w:r>
     </w:p>
     <w:p>
@@ -4596,41 +4995,76 @@
         </w:rPr>
         <w:t>User interaction flow</w:t>
       </w:r>
-    </w:p>
-    <w:p>
-      <w:pPr>
-        <w:ind w:left="360"/>
-        <w:rPr>
-          <w:lang w:val="en-US"/>
-        </w:rPr>
-      </w:pPr>
-    </w:p>
-    <w:p>
-      <w:pPr>
-        <w:ind w:left="360"/>
-        <w:rPr>
-          <w:lang w:val="en-US"/>
-        </w:rPr>
-      </w:pPr>
       <w:r>
         <w:rPr>
-          <w:b/>
-          <w:bCs/>
-          <w:highlight w:val="yellow"/>
-          <w:lang w:val="en-US"/>
-        </w:rPr>
-        <w:t>BOOKMARK: INSERT SEQUENCE DIAGRAMS</w:t>
+          <w:lang w:val="en-US"/>
+        </w:rPr>
+        <w:t xml:space="preserve"> </w:t>
+      </w:r>
+      <w:r>
+        <w:rPr>
+          <w:lang w:val="en-US"/>
+        </w:rPr>
+        <w:br/>
+      </w:r>
+      <w:r>
+        <w:rPr>
+          <w:lang w:val="en-US"/>
+        </w:rPr>
+        <w:drawing>
+          <wp:inline distT="0" distB="0" distL="0" distR="0" wp14:anchorId="384ED792" wp14:editId="43B0E05E">
+            <wp:extent cx="2263336" cy="4054191"/>
+            <wp:effectExtent l="0" t="0" r="3810" b="3810"/>
+            <wp:docPr id="1698308547" name="Picture 1"/>
+            <wp:cNvGraphicFramePr>
+              <a:graphicFrameLocks xmlns:a="http://schemas.openxmlformats.org/drawingml/2006/main" noChangeAspect="1"/>
+            </wp:cNvGraphicFramePr>
+            <a:graphic xmlns:a="http://schemas.openxmlformats.org/drawingml/2006/main">
+              <a:graphicData uri="http://schemas.openxmlformats.org/drawingml/2006/picture">
+                <pic:pic xmlns:pic="http://schemas.openxmlformats.org/drawingml/2006/picture">
+                  <pic:nvPicPr>
+                    <pic:cNvPr id="922741377" name=""/>
+                    <pic:cNvPicPr/>
+                  </pic:nvPicPr>
+                  <pic:blipFill>
+                    <a:blip r:embed="rId10"/>
+                    <a:stretch>
+                      <a:fillRect/>
+                    </a:stretch>
+                  </pic:blipFill>
+                  <pic:spPr>
+                    <a:xfrm>
+                      <a:off x="0" y="0"/>
+                      <a:ext cx="2263336" cy="4054191"/>
+                    </a:xfrm>
+                    <a:prstGeom prst="rect">
+                      <a:avLst/>
+                    </a:prstGeom>
+                  </pic:spPr>
+                </pic:pic>
+              </a:graphicData>
+            </a:graphic>
+          </wp:inline>
+        </w:drawing>
       </w:r>
     </w:p>
     <w:p>
       <w:pPr>
+        <w:ind w:left="360"/>
+        <w:rPr>
+          <w:lang w:val="en-US"/>
+        </w:rPr>
+      </w:pPr>
+    </w:p>
+    <w:p>
+      <w:pPr>
         <w:pStyle w:val="Heading1"/>
         <w:spacing w:before="240" w:after="120"/>
         <w:rPr>
           <w:lang w:val="en-US"/>
         </w:rPr>
       </w:pPr>
-      <w:bookmarkStart w:id="20" w:name="_Toc228386270"/>
+      <w:bookmarkStart w:id="20" w:name="_Toc228890773"/>
       <w:r>
         <w:rPr>
           <w:lang w:val="en-US"/>
@@ -4651,7 +5085,7 @@
           <w:lang w:val="en-US"/>
         </w:rPr>
       </w:pPr>
-      <w:bookmarkStart w:id="21" w:name="_Toc228386271"/>
+      <w:bookmarkStart w:id="21" w:name="_Toc228890774"/>
       <w:r>
         <w:rPr>
           <w:lang w:val="en-US"/>
@@ -4744,7 +5178,7 @@
           <w:lang w:val="en-US"/>
         </w:rPr>
       </w:pPr>
-      <w:bookmarkStart w:id="22" w:name="_Toc228386272"/>
+      <w:bookmarkStart w:id="22" w:name="_Toc228890775"/>
       <w:r>
         <w:rPr>
           <w:lang w:val="en-US"/>
@@ -4835,25 +5269,6 @@
     </w:p>
     <w:p>
       <w:pPr>
-        <w:ind w:left="360"/>
-        <w:rPr>
-          <w:b/>
-          <w:bCs/>
-          <w:lang w:val="en-US"/>
-        </w:rPr>
-      </w:pPr>
-      <w:r>
-        <w:rPr>
-          <w:b/>
-          <w:bCs/>
-          <w:highlight w:val="yellow"/>
-          <w:lang w:val="en-US"/>
-        </w:rPr>
-        <w:t>BOOKMARK: ADD DETAILED BUILD STEPS IF REQUIRED</w:t>
-      </w:r>
-    </w:p>
-    <w:p>
-      <w:pPr>
         <w:rPr>
           <w:lang w:val="en-US"/>
         </w:rPr>
@@ -4867,25 +5282,18 @@
     </w:p>
     <w:p>
       <w:pPr>
-        <w:ind w:left="360"/>
-        <w:rPr>
-          <w:lang w:val="en-US"/>
-        </w:rPr>
-      </w:pPr>
-    </w:p>
-    <w:p>
-      <w:pPr>
         <w:pStyle w:val="Heading1"/>
         <w:spacing w:before="240" w:after="120"/>
         <w:rPr>
           <w:lang w:val="en-US"/>
         </w:rPr>
       </w:pPr>
-      <w:bookmarkStart w:id="23" w:name="_Toc228386273"/>
+      <w:bookmarkStart w:id="23" w:name="_Toc228890776"/>
       <w:r>
         <w:rPr>
           <w:lang w:val="en-US"/>
         </w:rPr>
+        <w:lastRenderedPageBreak/>
         <w:t>Troubleshooting and Debugging</w:t>
       </w:r>
       <w:bookmarkEnd w:id="23"/>
@@ -4902,7 +5310,7 @@
           <w:lang w:val="en-US"/>
         </w:rPr>
       </w:pPr>
-      <w:bookmarkStart w:id="24" w:name="_Toc228386274"/>
+      <w:bookmarkStart w:id="24" w:name="_Toc228890777"/>
       <w:r>
         <w:rPr>
           <w:lang w:val="en-US"/>
@@ -5198,7 +5606,7 @@
           <w:lang w:val="en-US"/>
         </w:rPr>
       </w:pPr>
-      <w:bookmarkStart w:id="25" w:name="_Toc228386275"/>
+      <w:bookmarkStart w:id="25" w:name="_Toc228890778"/>
       <w:r>
         <w:rPr>
           <w:lang w:val="en-US"/>
@@ -5281,38 +5689,13 @@
     </w:p>
     <w:p>
       <w:pPr>
-        <w:ind w:left="360"/>
-        <w:rPr>
-          <w:lang w:val="en-US"/>
-        </w:rPr>
-      </w:pPr>
-    </w:p>
-    <w:p>
-      <w:pPr>
-        <w:ind w:left="360"/>
-        <w:rPr>
-          <w:lang w:val="en-US"/>
-        </w:rPr>
-      </w:pPr>
-      <w:r>
-        <w:rPr>
-          <w:b/>
-          <w:bCs/>
-          <w:highlight w:val="yellow"/>
-          <w:lang w:val="en-US"/>
-        </w:rPr>
-        <w:t>BOOKMARK: ADD REAL DEBUG CASES</w:t>
-      </w:r>
-    </w:p>
-    <w:p>
-      <w:pPr>
         <w:pStyle w:val="Heading1"/>
         <w:spacing w:before="240" w:after="120"/>
         <w:rPr>
           <w:lang w:val="en-US"/>
         </w:rPr>
       </w:pPr>
-      <w:bookmarkStart w:id="26" w:name="_Toc228386276"/>
+      <w:bookmarkStart w:id="26" w:name="_Toc228890779"/>
       <w:r>
         <w:rPr>
           <w:lang w:val="en-US"/>
@@ -5522,7 +5905,7 @@
           <w:lang w:val="en-US"/>
         </w:rPr>
       </w:pPr>
-      <w:bookmarkStart w:id="27" w:name="_Toc228386277"/>
+      <w:bookmarkStart w:id="27" w:name="_Toc228890780"/>
       <w:r>
         <w:rPr>
           <w:lang w:val="en-US"/>
@@ -5609,27 +5992,31 @@
         <w:spacing w:before="240" w:after="120"/>
       </w:pPr>
       <w:bookmarkStart w:id="28" w:name="_Toc228384448"/>
+      <w:bookmarkStart w:id="29" w:name="_Toc228890781"/>
       <w:r>
         <w:t>Document Management</w:t>
       </w:r>
       <w:bookmarkEnd w:id="28"/>
+      <w:bookmarkEnd w:id="29"/>
     </w:p>
     <w:p>
       <w:pPr>
         <w:pStyle w:val="Heading2"/>
       </w:pPr>
-      <w:bookmarkStart w:id="29" w:name="_Toc273437093"/>
-      <w:bookmarkStart w:id="30" w:name="_Toc228384449"/>
+      <w:bookmarkStart w:id="30" w:name="_Toc273437093"/>
+      <w:bookmarkStart w:id="31" w:name="_Toc228384449"/>
+      <w:bookmarkStart w:id="32" w:name="_Toc228890782"/>
       <w:r>
         <w:t>Contributors</w:t>
       </w:r>
-      <w:bookmarkEnd w:id="29"/>
       <w:bookmarkEnd w:id="30"/>
+      <w:bookmarkEnd w:id="31"/>
+      <w:bookmarkEnd w:id="32"/>
     </w:p>
     <w:p/>
     <w:tbl>
       <w:tblPr>
-        <w:tblW w:w="8568" w:type="dxa"/>
+        <w:tblW w:w="8545" w:type="dxa"/>
         <w:tblBorders>
           <w:top w:val="single" w:sz="4" w:space="0" w:color="auto"/>
           <w:left w:val="single" w:sz="4" w:space="0" w:color="auto"/>
@@ -5642,8 +6029,7 @@
       </w:tblPr>
       <w:tblGrid>
         <w:gridCol w:w="2808"/>
-        <w:gridCol w:w="1620"/>
-        <w:gridCol w:w="4140"/>
+        <w:gridCol w:w="5737"/>
       </w:tblGrid>
       <w:tr>
         <w:tc>
@@ -5669,29 +6055,7 @@
         </w:tc>
         <w:tc>
           <w:tcPr>
-            <w:tcW w:w="1620" w:type="dxa"/>
-            <w:shd w:val="pct12" w:color="auto" w:fill="FFFFFF"/>
-          </w:tcPr>
-          <w:p>
-            <w:pPr>
-              <w:pStyle w:val="Header"/>
-              <w:rPr>
-                <w:b/>
-                <w:bCs/>
-              </w:rPr>
-            </w:pPr>
-            <w:r>
-              <w:rPr>
-                <w:b/>
-                <w:bCs/>
-              </w:rPr>
-              <w:t>Unit</w:t>
-            </w:r>
-          </w:p>
-        </w:tc>
-        <w:tc>
-          <w:tcPr>
-            <w:tcW w:w="4140" w:type="dxa"/>
+            <w:tcW w:w="5737" w:type="dxa"/>
             <w:shd w:val="pct12" w:color="auto" w:fill="FFFFFF"/>
           </w:tcPr>
           <w:p>
@@ -5715,57 +6079,6 @@
         <w:tc>
           <w:tcPr>
             <w:tcW w:w="2808" w:type="dxa"/>
-            <w:shd w:val="clear" w:color="auto" w:fill="FFFFFF"/>
-          </w:tcPr>
-          <w:p>
-            <w:r>
-              <w:t>Production Management Support Coordinator</w:t>
-            </w:r>
-          </w:p>
-        </w:tc>
-        <w:tc>
-          <w:tcPr>
-            <w:tcW w:w="1620" w:type="dxa"/>
-            <w:shd w:val="clear" w:color="auto" w:fill="FFFFFF"/>
-          </w:tcPr>
-          <w:p/>
-        </w:tc>
-        <w:tc>
-          <w:tcPr>
-            <w:tcW w:w="4140" w:type="dxa"/>
-            <w:shd w:val="clear" w:color="auto" w:fill="FFFFFF"/>
-          </w:tcPr>
-          <w:p/>
-        </w:tc>
-      </w:tr>
-      <w:tr>
-        <w:tc>
-          <w:tcPr>
-            <w:tcW w:w="2808" w:type="dxa"/>
-          </w:tcPr>
-          <w:p>
-            <w:r>
-              <w:t xml:space="preserve">Systems Analyst Designer </w:t>
-            </w:r>
-          </w:p>
-        </w:tc>
-        <w:tc>
-          <w:tcPr>
-            <w:tcW w:w="1620" w:type="dxa"/>
-          </w:tcPr>
-          <w:p/>
-        </w:tc>
-        <w:tc>
-          <w:tcPr>
-            <w:tcW w:w="4140" w:type="dxa"/>
-          </w:tcPr>
-          <w:p/>
-        </w:tc>
-      </w:tr>
-      <w:tr>
-        <w:tc>
-          <w:tcPr>
-            <w:tcW w:w="2808" w:type="dxa"/>
           </w:tcPr>
           <w:p>
             <w:r>
@@ -5775,15 +6088,13 @@
         </w:tc>
         <w:tc>
           <w:tcPr>
-            <w:tcW w:w="1620" w:type="dxa"/>
+            <w:tcW w:w="5737" w:type="dxa"/>
           </w:tcPr>
-          <w:p/>
-        </w:tc>
-        <w:tc>
-          <w:tcPr>
-            <w:tcW w:w="4140" w:type="dxa"/>
-          </w:tcPr>
-          <w:p/>
+          <w:p>
+            <w:r>
+              <w:t>Nick Pokusa</w:t>
+            </w:r>
+          </w:p>
         </w:tc>
       </w:tr>
       <w:tr>
@@ -5800,41 +6111,14 @@
         </w:tc>
         <w:tc>
           <w:tcPr>
-            <w:tcW w:w="1620" w:type="dxa"/>
+            <w:tcW w:w="5737" w:type="dxa"/>
             <w:shd w:val="clear" w:color="auto" w:fill="FFFFFF"/>
-          </w:tcPr>
-          <w:p/>
-        </w:tc>
-        <w:tc>
-          <w:tcPr>
-            <w:tcW w:w="4140" w:type="dxa"/>
-            <w:shd w:val="clear" w:color="auto" w:fill="FFFFFF"/>
-          </w:tcPr>
-          <w:p/>
-        </w:tc>
-      </w:tr>
-      <w:tr>
-        <w:tc>
-          <w:tcPr>
-            <w:tcW w:w="2808" w:type="dxa"/>
           </w:tcPr>
           <w:p>
             <w:r>
-              <w:t>Project Sponsor</w:t>
+              <w:t>Jessica Coffel</w:t>
             </w:r>
           </w:p>
-        </w:tc>
-        <w:tc>
-          <w:tcPr>
-            <w:tcW w:w="1620" w:type="dxa"/>
-          </w:tcPr>
-          <w:p/>
-        </w:tc>
-        <w:tc>
-          <w:tcPr>
-            <w:tcW w:w="4140" w:type="dxa"/>
-          </w:tcPr>
-          <w:p/>
         </w:tc>
       </w:tr>
       <w:tr>
@@ -5850,55 +6134,31 @@
         </w:tc>
         <w:tc>
           <w:tcPr>
-            <w:tcW w:w="1620" w:type="dxa"/>
-          </w:tcPr>
-          <w:p/>
-        </w:tc>
-        <w:tc>
-          <w:tcPr>
-            <w:tcW w:w="4140" w:type="dxa"/>
-          </w:tcPr>
-          <w:p/>
-        </w:tc>
-      </w:tr>
-      <w:tr>
-        <w:tc>
-          <w:tcPr>
-            <w:tcW w:w="2808" w:type="dxa"/>
+            <w:tcW w:w="5737" w:type="dxa"/>
           </w:tcPr>
           <w:p>
             <w:r>
-              <w:t>Other document contributors</w:t>
+              <w:t>Tom DiGuido</w:t>
             </w:r>
           </w:p>
-        </w:tc>
-        <w:tc>
-          <w:tcPr>
-            <w:tcW w:w="1620" w:type="dxa"/>
-          </w:tcPr>
-          <w:p/>
-        </w:tc>
-        <w:tc>
-          <w:tcPr>
-            <w:tcW w:w="4140" w:type="dxa"/>
-          </w:tcPr>
-          <w:p/>
         </w:tc>
       </w:tr>
     </w:tbl>
     <w:p>
-      <w:bookmarkStart w:id="31" w:name="_Toc273437094"/>
-      <w:bookmarkStart w:id="32" w:name="_Toc228384450"/>
+      <w:bookmarkStart w:id="33" w:name="_Toc273437094"/>
+      <w:bookmarkStart w:id="34" w:name="_Toc228384450"/>
     </w:p>
     <w:p>
       <w:pPr>
         <w:pStyle w:val="Heading2"/>
       </w:pPr>
+      <w:bookmarkStart w:id="35" w:name="_Toc228890783"/>
       <w:r>
         <w:t>Version Control</w:t>
       </w:r>
-      <w:bookmarkEnd w:id="31"/>
-      <w:bookmarkEnd w:id="32"/>
+      <w:bookmarkEnd w:id="33"/>
+      <w:bookmarkEnd w:id="34"/>
+      <w:bookmarkEnd w:id="35"/>
     </w:p>
     <w:p/>
     <w:tbl>
@@ -5940,7 +6200,6 @@
                 <w:b/>
                 <w:bCs/>
               </w:rPr>
-              <w:lastRenderedPageBreak/>
               <w:t>Date</w:t>
             </w:r>
           </w:p>
@@ -6034,8 +6293,12 @@
         <w:tc>
           <w:tcPr>
             <w:tcW w:w="1008" w:type="dxa"/>
+            <w:vAlign w:val="center"/>
           </w:tcPr>
           <w:p>
+            <w:pPr>
+              <w:jc w:val="center"/>
+            </w:pPr>
             <w:r>
               <w:t>04/29/26</w:t>
             </w:r>
@@ -6044,8 +6307,12 @@
         <w:tc>
           <w:tcPr>
             <w:tcW w:w="967" w:type="dxa"/>
+            <w:vAlign w:val="center"/>
           </w:tcPr>
           <w:p>
+            <w:pPr>
+              <w:jc w:val="center"/>
+            </w:pPr>
             <w:r>
               <w:t>1.0</w:t>
             </w:r>
@@ -6054,8 +6321,12 @@
         <w:tc>
           <w:tcPr>
             <w:tcW w:w="1620" w:type="dxa"/>
+            <w:vAlign w:val="center"/>
           </w:tcPr>
           <w:p>
+            <w:pPr>
+              <w:jc w:val="center"/>
+            </w:pPr>
             <w:r>
               <w:t>Tom DiGuido</w:t>
             </w:r>
@@ -6064,8 +6335,12 @@
         <w:tc>
           <w:tcPr>
             <w:tcW w:w="1890" w:type="dxa"/>
+            <w:vAlign w:val="center"/>
           </w:tcPr>
           <w:p>
+            <w:pPr>
+              <w:jc w:val="center"/>
+            </w:pPr>
             <w:r>
               <w:t>All</w:t>
             </w:r>
@@ -6074,8 +6349,12 @@
         <w:tc>
           <w:tcPr>
             <w:tcW w:w="3037" w:type="dxa"/>
+            <w:vAlign w:val="center"/>
           </w:tcPr>
           <w:p>
+            <w:pPr>
+              <w:jc w:val="center"/>
+            </w:pPr>
             <w:r>
               <w:t>Initial draft</w:t>
             </w:r>
@@ -6086,128 +6365,72 @@
         <w:tc>
           <w:tcPr>
             <w:tcW w:w="1008" w:type="dxa"/>
+            <w:vAlign w:val="center"/>
           </w:tcPr>
-          <w:p/>
+          <w:p>
+            <w:pPr>
+              <w:jc w:val="center"/>
+            </w:pPr>
+            <w:r>
+              <w:t>5/45/26</w:t>
+            </w:r>
+          </w:p>
         </w:tc>
         <w:tc>
           <w:tcPr>
             <w:tcW w:w="967" w:type="dxa"/>
+            <w:vAlign w:val="center"/>
           </w:tcPr>
-          <w:p/>
+          <w:p>
+            <w:pPr>
+              <w:jc w:val="center"/>
+            </w:pPr>
+            <w:r>
+              <w:t>1.1</w:t>
+            </w:r>
+          </w:p>
         </w:tc>
         <w:tc>
           <w:tcPr>
             <w:tcW w:w="1620" w:type="dxa"/>
+            <w:vAlign w:val="center"/>
           </w:tcPr>
-          <w:p/>
+          <w:p>
+            <w:pPr>
+              <w:jc w:val="center"/>
+            </w:pPr>
+            <w:r>
+              <w:t>Tom DiGuido</w:t>
+            </w:r>
+          </w:p>
         </w:tc>
         <w:tc>
           <w:tcPr>
             <w:tcW w:w="1890" w:type="dxa"/>
+            <w:vAlign w:val="center"/>
           </w:tcPr>
-          <w:p/>
+          <w:p>
+            <w:pPr>
+              <w:jc w:val="center"/>
+            </w:pPr>
+            <w:r>
+              <w:t>All</w:t>
+            </w:r>
+          </w:p>
         </w:tc>
         <w:tc>
           <w:tcPr>
             <w:tcW w:w="3037" w:type="dxa"/>
+            <w:vAlign w:val="center"/>
           </w:tcPr>
-          <w:p/>
-        </w:tc>
-      </w:tr>
-      <w:tr>
-        <w:tc>
-          <w:tcPr>
-            <w:tcW w:w="1008" w:type="dxa"/>
-          </w:tcPr>
-          <w:p/>
-        </w:tc>
-        <w:tc>
-          <w:tcPr>
-            <w:tcW w:w="967" w:type="dxa"/>
-          </w:tcPr>
-          <w:p/>
-        </w:tc>
-        <w:tc>
-          <w:tcPr>
-            <w:tcW w:w="1620" w:type="dxa"/>
-          </w:tcPr>
-          <w:p/>
-        </w:tc>
-        <w:tc>
-          <w:tcPr>
-            <w:tcW w:w="1890" w:type="dxa"/>
-          </w:tcPr>
-          <w:p/>
-        </w:tc>
-        <w:tc>
-          <w:tcPr>
-            <w:tcW w:w="3037" w:type="dxa"/>
-          </w:tcPr>
-          <w:p/>
-        </w:tc>
-      </w:tr>
-      <w:tr>
-        <w:tc>
-          <w:tcPr>
-            <w:tcW w:w="1008" w:type="dxa"/>
-          </w:tcPr>
-          <w:p/>
-        </w:tc>
-        <w:tc>
-          <w:tcPr>
-            <w:tcW w:w="967" w:type="dxa"/>
-          </w:tcPr>
-          <w:p/>
-        </w:tc>
-        <w:tc>
-          <w:tcPr>
-            <w:tcW w:w="1620" w:type="dxa"/>
-          </w:tcPr>
-          <w:p/>
-        </w:tc>
-        <w:tc>
-          <w:tcPr>
-            <w:tcW w:w="1890" w:type="dxa"/>
-          </w:tcPr>
-          <w:p/>
-        </w:tc>
-        <w:tc>
-          <w:tcPr>
-            <w:tcW w:w="3037" w:type="dxa"/>
-          </w:tcPr>
-          <w:p/>
-        </w:tc>
-      </w:tr>
-      <w:tr>
-        <w:tc>
-          <w:tcPr>
-            <w:tcW w:w="1008" w:type="dxa"/>
-          </w:tcPr>
-          <w:p/>
-        </w:tc>
-        <w:tc>
-          <w:tcPr>
-            <w:tcW w:w="967" w:type="dxa"/>
-          </w:tcPr>
-          <w:p/>
-        </w:tc>
-        <w:tc>
-          <w:tcPr>
-            <w:tcW w:w="1620" w:type="dxa"/>
-          </w:tcPr>
-          <w:p/>
-        </w:tc>
-        <w:tc>
-          <w:tcPr>
-            <w:tcW w:w="1890" w:type="dxa"/>
-          </w:tcPr>
-          <w:p/>
-        </w:tc>
-        <w:tc>
-          <w:tcPr>
-            <w:tcW w:w="3037" w:type="dxa"/>
-          </w:tcPr>
-          <w:p/>
+          <w:p>
+            <w:pPr>
+              <w:jc w:val="center"/>
+            </w:pPr>
+            <w:r>
+              <w:t>Edits and inserted images and diagrams.</w:t>
+            </w:r>
+          </w:p>
         </w:tc>
       </w:tr>
       <w:tr>
@@ -6310,8 +6533,8 @@
     <w:p/>
     <w:p/>
     <w:sectPr>
-      <w:headerReference w:type="default" r:id="rId7"/>
-      <w:footerReference w:type="default" r:id="rId8"/>
+      <w:headerReference w:type="default" r:id="rId11"/>
+      <w:footerReference w:type="default" r:id="rId12"/>
       <w:pgSz w:w="11906" w:h="16838"/>
       <w:pgMar w:top="1134" w:right="1418" w:bottom="1134" w:left="1418" w:header="709" w:footer="709" w:gutter="0"/>
       <w:cols w:space="708"/>
@@ -14973,7 +15196,7 @@
         <w:rFonts w:ascii="Symbol" w:hAnsi="Symbol" w:hint="default"/>
       </w:rPr>
     </w:lvl>
-    <w:lvl w:ilvl="1" w:tplc="04090003" w:tentative="1">
+    <w:lvl w:ilvl="1" w:tplc="04090003">
       <w:start w:val="1"/>
       <w:numFmt w:val="bullet"/>
       <w:lvlText w:val="o"/>
@@ -18220,7 +18443,6 @@
   <w:style w:type="character" w:default="1" w:styleId="DefaultParagraphFont">
     <w:name w:val="Default Paragraph Font"/>
     <w:uiPriority w:val="1"/>
-    <w:semiHidden/>
     <w:unhideWhenUsed/>
   </w:style>
   <w:style w:type="table" w:default="1" w:styleId="TableNormal">
@@ -18250,13 +18472,13 @@
     <w:next w:val="Normal"/>
     <w:autoRedefine/>
     <w:semiHidden/>
-    <w:rsid w:val="002D0B56"/>
+    <w:rsid w:val="00995F5B"/>
     <w:pPr>
       <w:tabs>
         <w:tab w:val="left" w:pos="480"/>
         <w:tab w:val="right" w:leader="dot" w:pos="8280"/>
       </w:tabs>
-      <w:spacing w:before="360"/>
+      <w:spacing w:before="240"/>
     </w:pPr>
     <w:rPr>
       <w:rFonts w:ascii="Arial" w:hAnsi="Arial"/>
@@ -18678,6 +18900,18 @@
       <w:lang w:val="en-GB"/>
     </w:rPr>
   </w:style>
+  <w:style w:type="character" w:styleId="UnresolvedMention">
+    <w:name w:val="Unresolved Mention"/>
+    <w:basedOn w:val="DefaultParagraphFont"/>
+    <w:uiPriority w:val="99"/>
+    <w:semiHidden/>
+    <w:unhideWhenUsed/>
+    <w:rsid w:val="00B57F93"/>
+    <w:rPr>
+      <w:color w:val="605E5C"/>
+      <w:shd w:val="clear" w:color="auto" w:fill="E1DFDD"/>
+    </w:rPr>
+  </w:style>
 </w:styles>
 </file>
 
@@ -18994,4 +19228,16 @@
     </a:ext>
   </a:extLst>
 </a:theme>
+</file>
+
+<file path=customXml/item1.xml><?xml version="1.0" encoding="utf-8"?>
+<b:Sources xmlns:b="http://schemas.openxmlformats.org/officeDocument/2006/bibliography" xmlns="http://schemas.openxmlformats.org/officeDocument/2006/bibliography" SelectedStyle="\APASixthEditionOfficeOnline.xsl" StyleName="APA" Version="6"/>
+</file>
+
+<file path=customXml/itemProps1.xml><?xml version="1.0" encoding="utf-8"?>
+<ds:datastoreItem xmlns:ds="http://schemas.openxmlformats.org/officeDocument/2006/customXml" ds:itemID="{77D908A7-30B7-45AC-BA2F-44391ADE4737}">
+  <ds:schemaRefs>
+    <ds:schemaRef ds:uri="http://schemas.openxmlformats.org/officeDocument/2006/bibliography"/>
+  </ds:schemaRefs>
+</ds:datastoreItem>
 </file>
</xml_diff>

<commit_message>
Updated System description Document
</commit_message>
<xml_diff>
--- a/Insomniac_Technical_Support_Document.docx
+++ b/Insomniac_Technical_Support_Document.docx
@@ -1456,7 +1456,16 @@
             <w:noProof/>
             <w:lang w:val="en-US"/>
           </w:rPr>
-          <w:t>Software Architecture</w:t>
+          <w:t xml:space="preserve">Software </w:t>
+        </w:r>
+        <w:r>
+          <w:rPr>
+            <w:rStyle w:val="Hyperlink"/>
+            <w:rFonts w:ascii="Times New Roman" w:hAnsi="Times New Roman"/>
+            <w:noProof/>
+            <w:lang w:val="en-US"/>
+          </w:rPr>
+          <w:t>Architecture</w:t>
         </w:r>
         <w:r>
           <w:rPr>
@@ -3609,6 +3618,7 @@
       </w:pPr>
       <w:r>
         <w:rPr>
+          <w:noProof/>
           <w:lang w:val="en-US"/>
         </w:rPr>
         <w:drawing>
@@ -4237,6 +4247,7 @@
       </w:pPr>
       <w:r>
         <w:rPr>
+          <w:noProof/>
           <w:lang w:val="en-US"/>
         </w:rPr>
         <w:drawing>
@@ -5009,6 +5020,7 @@
       </w:r>
       <w:r>
         <w:rPr>
+          <w:noProof/>
           <w:lang w:val="en-US"/>
         </w:rPr>
         <w:drawing>
@@ -6750,7 +6762,10 @@
             <w:t xml:space="preserve">Version: </w:t>
           </w:r>
           <w:r>
-            <w:t>1.0</w:t>
+            <w:t>1.</w:t>
+          </w:r>
+          <w:r>
+            <w:t>1</w:t>
           </w:r>
         </w:p>
       </w:tc>
@@ -18443,6 +18458,7 @@
   <w:style w:type="character" w:default="1" w:styleId="DefaultParagraphFont">
     <w:name w:val="Default Paragraph Font"/>
     <w:uiPriority w:val="1"/>
+    <w:semiHidden/>
     <w:unhideWhenUsed/>
   </w:style>
   <w:style w:type="table" w:default="1" w:styleId="TableNormal">

</xml_diff>